<commit_message>
Doc: Manual de usuario
</commit_message>
<xml_diff>
--- a/PP3_SebastiánSandíBlanco_MelanyBustosCerdas/documentacion/Manual_de_usuario.docx
+++ b/PP3_SebastiánSandíBlanco_MelanyBustosCerdas/documentacion/Manual_de_usuario.docx
@@ -334,23 +334,69 @@
         <w:t>flex</w:t>
       </w:r>
       <w:proofErr w:type="spellEnd"/>
+      <w:r>
+        <w:rPr>
+          <w:rFonts w:ascii="Times New Roman" w:hAnsi="Times New Roman" w:cs="Times New Roman"/>
+          <w:lang w:val="es-ES"/>
+        </w:rPr>
+        <w:t>,</w:t>
+      </w:r>
+      <w:r>
+        <w:rPr>
+          <w:rFonts w:ascii="Times New Roman" w:hAnsi="Times New Roman" w:cs="Times New Roman"/>
+          <w:lang w:val="es-ES"/>
+        </w:rPr>
+        <w:t xml:space="preserve"> .cup</w:t>
+      </w:r>
       <w:proofErr w:type="gramEnd"/>
       <w:r>
         <w:rPr>
           <w:rFonts w:ascii="Times New Roman" w:hAnsi="Times New Roman" w:cs="Times New Roman"/>
           <w:lang w:val="es-ES"/>
         </w:rPr>
-        <w:t xml:space="preserve"> </w:t>
-      </w:r>
-      <w:proofErr w:type="gramStart"/>
-      <w:r>
-        <w:rPr>
-          <w:rFonts w:ascii="Times New Roman" w:hAnsi="Times New Roman" w:cs="Times New Roman"/>
-          <w:lang w:val="es-ES"/>
-        </w:rPr>
-        <w:t>y .cup</w:t>
-      </w:r>
-      <w:proofErr w:type="gramEnd"/>
+        <w:t xml:space="preserve">, clase </w:t>
+      </w:r>
+      <w:proofErr w:type="spellStart"/>
+      <w:r>
+        <w:rPr>
+          <w:rFonts w:ascii="Times New Roman" w:hAnsi="Times New Roman" w:cs="Times New Roman"/>
+          <w:lang w:val="es-ES"/>
+        </w:rPr>
+        <w:t>InstruccionIntermedia</w:t>
+      </w:r>
+      <w:proofErr w:type="spellEnd"/>
+      <w:r>
+        <w:rPr>
+          <w:rFonts w:ascii="Times New Roman" w:hAnsi="Times New Roman" w:cs="Times New Roman"/>
+          <w:lang w:val="es-ES"/>
+        </w:rPr>
+        <w:t xml:space="preserve">, clase </w:t>
+      </w:r>
+      <w:proofErr w:type="spellStart"/>
+      <w:r>
+        <w:rPr>
+          <w:rFonts w:ascii="Times New Roman" w:hAnsi="Times New Roman" w:cs="Times New Roman"/>
+          <w:lang w:val="es-ES"/>
+        </w:rPr>
+        <w:t>CodigoIntermedio</w:t>
+      </w:r>
+      <w:proofErr w:type="spellEnd"/>
+      <w:r>
+        <w:rPr>
+          <w:rFonts w:ascii="Times New Roman" w:hAnsi="Times New Roman" w:cs="Times New Roman"/>
+          <w:lang w:val="es-ES"/>
+        </w:rPr>
+        <w:t xml:space="preserve"> y clase </w:t>
+      </w:r>
+      <w:proofErr w:type="spellStart"/>
+      <w:r>
+        <w:rPr>
+          <w:rFonts w:ascii="Times New Roman" w:hAnsi="Times New Roman" w:cs="Times New Roman"/>
+          <w:lang w:val="es-ES"/>
+        </w:rPr>
+        <w:t>GeneradorMIPS</w:t>
+      </w:r>
+      <w:proofErr w:type="spellEnd"/>
     </w:p>
     <w:p>
       <w:pPr>
@@ -480,7 +526,37 @@
           <w:rFonts w:ascii="Times New Roman" w:hAnsi="Times New Roman" w:cs="Times New Roman"/>
           <w:lang w:val="es-ES"/>
         </w:rPr>
-        <w:t>El código fuente a procesar (</w:t>
+        <w:t xml:space="preserve">El código fuente a procesar </w:t>
+      </w:r>
+      <w:r>
+        <w:rPr>
+          <w:rFonts w:ascii="Times New Roman" w:hAnsi="Times New Roman" w:cs="Times New Roman"/>
+          <w:lang w:val="es-ES"/>
+        </w:rPr>
+        <w:t xml:space="preserve">y el archivo </w:t>
+      </w:r>
+      <w:proofErr w:type="spellStart"/>
+      <w:r>
+        <w:rPr>
+          <w:rFonts w:ascii="Times New Roman" w:hAnsi="Times New Roman" w:cs="Times New Roman"/>
+          <w:lang w:val="es-ES"/>
+        </w:rPr>
+        <w:t>asm</w:t>
+      </w:r>
+      <w:proofErr w:type="spellEnd"/>
+      <w:r>
+        <w:rPr>
+          <w:rFonts w:ascii="Times New Roman" w:hAnsi="Times New Roman" w:cs="Times New Roman"/>
+          <w:lang w:val="es-ES"/>
+        </w:rPr>
+        <w:t xml:space="preserve"> para la ejecución en MIPS </w:t>
+      </w:r>
+      <w:r>
+        <w:rPr>
+          <w:rFonts w:ascii="Times New Roman" w:hAnsi="Times New Roman" w:cs="Times New Roman"/>
+          <w:lang w:val="es-ES"/>
+        </w:rPr>
+        <w:t>(</w:t>
       </w:r>
       <w:r>
         <w:rPr>
@@ -576,6 +652,7 @@
         <w:pStyle w:val="Prrafodelista"/>
         <w:rPr>
           <w:noProof/>
+          <w:lang w:val="es-ES"/>
         </w:rPr>
       </w:pPr>
     </w:p>
@@ -710,6 +787,7 @@
           <w:rFonts w:ascii="Times New Roman" w:hAnsi="Times New Roman" w:cs="Times New Roman"/>
           <w:lang w:val="es-ES"/>
         </w:rPr>
+        <w:lastRenderedPageBreak/>
         <w:t xml:space="preserve">En el caso de utilizar el IDE de </w:t>
       </w:r>
       <w:proofErr w:type="spellStart"/>
@@ -815,7 +893,6 @@
         <w:rPr>
           <w:noProof/>
         </w:rPr>
-        <w:lastRenderedPageBreak/>
         <w:drawing>
           <wp:inline distT="0" distB="0" distL="0" distR="0" wp14:anchorId="6AED2D12" wp14:editId="55AB29AD">
             <wp:extent cx="3181350" cy="2037579"/>
@@ -1217,6 +1294,7 @@
         <w:rPr>
           <w:noProof/>
         </w:rPr>
+        <w:lastRenderedPageBreak/>
         <w:drawing>
           <wp:inline distT="0" distB="0" distL="0" distR="0" wp14:anchorId="3E3C3601" wp14:editId="6337B86F">
             <wp:extent cx="5172075" cy="1322305"/>
@@ -1266,7 +1344,6 @@
         <w:rPr>
           <w:noProof/>
         </w:rPr>
-        <w:lastRenderedPageBreak/>
         <w:drawing>
           <wp:inline distT="0" distB="0" distL="0" distR="0" wp14:anchorId="215325D0" wp14:editId="646AC508">
             <wp:extent cx="4629150" cy="1136516"/>
@@ -1673,6 +1750,7 @@
         <w:rPr>
           <w:noProof/>
         </w:rPr>
+        <w:lastRenderedPageBreak/>
         <w:drawing>
           <wp:inline distT="0" distB="0" distL="0" distR="0" wp14:anchorId="5699A3B3" wp14:editId="559BA5F6">
             <wp:extent cx="4152900" cy="1399854"/>
@@ -1742,7 +1820,6 @@
           <w:iCs/>
           <w:lang w:val="es-ES"/>
         </w:rPr>
-        <w:lastRenderedPageBreak/>
         <w:t>java -</w:t>
       </w:r>
       <w:proofErr w:type="spellStart"/>
@@ -2020,6 +2097,7 @@
         <w:rPr>
           <w:noProof/>
         </w:rPr>
+        <w:lastRenderedPageBreak/>
         <w:drawing>
           <wp:inline distT="0" distB="0" distL="0" distR="0" wp14:anchorId="38F0A1C6" wp14:editId="72075EBE">
             <wp:extent cx="5189603" cy="3505200"/>
@@ -2098,7 +2176,6 @@
           <w:bCs/>
           <w:lang w:val="es-ES"/>
         </w:rPr>
-        <w:lastRenderedPageBreak/>
         <w:t xml:space="preserve">Ejecutar Main </w:t>
       </w:r>
       <w:r>
@@ -2269,11 +2346,12 @@
         <w:rPr>
           <w:noProof/>
         </w:rPr>
+        <w:lastRenderedPageBreak/>
         <w:drawing>
-          <wp:inline distT="0" distB="0" distL="0" distR="0" wp14:anchorId="50097D50" wp14:editId="469D06BA">
-            <wp:extent cx="4198918" cy="2475857"/>
-            <wp:effectExtent l="0" t="0" r="0" b="1270"/>
-            <wp:docPr id="1617126583" name="Imagen 1" descr="Texto"/>
+          <wp:inline distT="0" distB="0" distL="0" distR="0" wp14:anchorId="0C4A5A95" wp14:editId="3995431C">
+            <wp:extent cx="4473256" cy="2428875"/>
+            <wp:effectExtent l="0" t="0" r="3810" b="0"/>
+            <wp:docPr id="1249135742" name="Imagen 1" descr="Texto&#10;&#10;El contenido generado por IA puede ser incorrecto."/>
             <wp:cNvGraphicFramePr>
               <a:graphicFrameLocks xmlns:a="http://schemas.openxmlformats.org/drawingml/2006/main" noChangeAspect="1"/>
             </wp:cNvGraphicFramePr>
@@ -2281,7 +2359,7 @@
               <a:graphicData uri="http://schemas.openxmlformats.org/drawingml/2006/picture">
                 <pic:pic xmlns:pic="http://schemas.openxmlformats.org/drawingml/2006/picture">
                   <pic:nvPicPr>
-                    <pic:cNvPr id="1617126583" name="Imagen 1" descr="Texto"/>
+                    <pic:cNvPr id="1249135742" name="Imagen 1" descr="Texto&#10;&#10;El contenido generado por IA puede ser incorrecto."/>
                     <pic:cNvPicPr/>
                   </pic:nvPicPr>
                   <pic:blipFill>
@@ -2293,7 +2371,7 @@
                   <pic:spPr>
                     <a:xfrm>
                       <a:off x="0" y="0"/>
-                      <a:ext cx="4210477" cy="2482673"/>
+                      <a:ext cx="4486887" cy="2436276"/>
                     </a:xfrm>
                     <a:prstGeom prst="rect">
                       <a:avLst/>
@@ -2363,7 +2441,23 @@
           <w:color w:val="156082" w:themeColor="accent1"/>
           <w:lang w:val="es-ES"/>
         </w:rPr>
-        <w:t xml:space="preserve">Realizar el análisis sintáctico del archivo </w:t>
+        <w:t>Realizar el análisis sintáctico</w:t>
+      </w:r>
+      <w:r>
+        <w:rPr>
+          <w:rFonts w:ascii="Times New Roman" w:hAnsi="Times New Roman" w:cs="Times New Roman"/>
+          <w:color w:val="156082" w:themeColor="accent1"/>
+          <w:lang w:val="es-ES"/>
+        </w:rPr>
+        <w:t xml:space="preserve"> y semántico</w:t>
+      </w:r>
+      <w:r>
+        <w:rPr>
+          <w:rFonts w:ascii="Times New Roman" w:hAnsi="Times New Roman" w:cs="Times New Roman"/>
+          <w:color w:val="156082" w:themeColor="accent1"/>
+          <w:lang w:val="es-ES"/>
+        </w:rPr>
+        <w:t xml:space="preserve"> del archivo </w:t>
       </w:r>
       <w:proofErr w:type="spellStart"/>
       <w:r>
@@ -2381,7 +2475,23 @@
           <w:color w:val="156082" w:themeColor="accent1"/>
           <w:lang w:val="es-ES"/>
         </w:rPr>
-        <w:t xml:space="preserve"> (Proyecto #2).</w:t>
+        <w:t xml:space="preserve"> (Proyecto #2</w:t>
+      </w:r>
+      <w:r>
+        <w:rPr>
+          <w:rFonts w:ascii="Times New Roman" w:hAnsi="Times New Roman" w:cs="Times New Roman"/>
+          <w:color w:val="156082" w:themeColor="accent1"/>
+          <w:lang w:val="es-ES"/>
+        </w:rPr>
+        <w:t xml:space="preserve"> - #3</w:t>
+      </w:r>
+      <w:r>
+        <w:rPr>
+          <w:rFonts w:ascii="Times New Roman" w:hAnsi="Times New Roman" w:cs="Times New Roman"/>
+          <w:color w:val="156082" w:themeColor="accent1"/>
+          <w:lang w:val="es-ES"/>
+        </w:rPr>
+        <w:t>).</w:t>
       </w:r>
     </w:p>
     <w:p>
@@ -2423,6 +2533,48 @@
           <w:color w:val="156082" w:themeColor="accent1"/>
           <w:lang w:val="es-ES"/>
         </w:rPr>
+        <w:t>Imprimir el código intermedio generado a partir del código fuente.</w:t>
+      </w:r>
+    </w:p>
+    <w:p>
+      <w:pPr>
+        <w:pStyle w:val="Prrafodelista"/>
+        <w:numPr>
+          <w:ilvl w:val="0"/>
+          <w:numId w:val="12"/>
+        </w:numPr>
+        <w:rPr>
+          <w:rFonts w:ascii="Times New Roman" w:hAnsi="Times New Roman" w:cs="Times New Roman"/>
+          <w:lang w:val="es-ES"/>
+        </w:rPr>
+      </w:pPr>
+      <w:r>
+        <w:rPr>
+          <w:rFonts w:ascii="Times New Roman" w:hAnsi="Times New Roman" w:cs="Times New Roman"/>
+          <w:color w:val="156082" w:themeColor="accent1"/>
+          <w:lang w:val="es-ES"/>
+        </w:rPr>
+        <w:t>Imprimir el código máquina generado a partir del código intermedio.</w:t>
+      </w:r>
+    </w:p>
+    <w:p>
+      <w:pPr>
+        <w:pStyle w:val="Prrafodelista"/>
+        <w:numPr>
+          <w:ilvl w:val="0"/>
+          <w:numId w:val="12"/>
+        </w:numPr>
+        <w:rPr>
+          <w:rFonts w:ascii="Times New Roman" w:hAnsi="Times New Roman" w:cs="Times New Roman"/>
+          <w:lang w:val="es-ES"/>
+        </w:rPr>
+      </w:pPr>
+      <w:r>
+        <w:rPr>
+          <w:rFonts w:ascii="Times New Roman" w:hAnsi="Times New Roman" w:cs="Times New Roman"/>
+          <w:color w:val="156082" w:themeColor="accent1"/>
+          <w:lang w:val="es-ES"/>
+        </w:rPr>
         <w:t>La opción de salir / detener el código.</w:t>
       </w:r>
     </w:p>
@@ -2436,46 +2588,6 @@
     </w:p>
     <w:p>
       <w:pPr>
-        <w:rPr>
-          <w:rFonts w:ascii="Times New Roman" w:hAnsi="Times New Roman" w:cs="Times New Roman"/>
-          <w:lang w:val="es-ES"/>
-        </w:rPr>
-      </w:pPr>
-    </w:p>
-    <w:p>
-      <w:pPr>
-        <w:rPr>
-          <w:rFonts w:ascii="Times New Roman" w:hAnsi="Times New Roman" w:cs="Times New Roman"/>
-          <w:lang w:val="es-ES"/>
-        </w:rPr>
-      </w:pPr>
-    </w:p>
-    <w:p>
-      <w:pPr>
-        <w:rPr>
-          <w:rFonts w:ascii="Times New Roman" w:hAnsi="Times New Roman" w:cs="Times New Roman"/>
-          <w:lang w:val="es-ES"/>
-        </w:rPr>
-      </w:pPr>
-    </w:p>
-    <w:p>
-      <w:pPr>
-        <w:rPr>
-          <w:rFonts w:ascii="Times New Roman" w:hAnsi="Times New Roman" w:cs="Times New Roman"/>
-          <w:lang w:val="es-ES"/>
-        </w:rPr>
-      </w:pPr>
-    </w:p>
-    <w:p>
-      <w:pPr>
-        <w:rPr>
-          <w:rFonts w:ascii="Times New Roman" w:hAnsi="Times New Roman" w:cs="Times New Roman"/>
-          <w:lang w:val="es-ES"/>
-        </w:rPr>
-      </w:pPr>
-    </w:p>
-    <w:p>
-      <w:pPr>
         <w:pStyle w:val="Prrafodelista"/>
         <w:ind w:left="360"/>
         <w:rPr>
@@ -2488,7 +2600,6 @@
           <w:rFonts w:ascii="Times New Roman" w:hAnsi="Times New Roman" w:cs="Times New Roman"/>
           <w:lang w:val="es-ES"/>
         </w:rPr>
-        <w:lastRenderedPageBreak/>
         <w:t>Resultado esperado</w:t>
       </w:r>
       <w:r>
@@ -2496,7 +2607,21 @@
           <w:rFonts w:ascii="Times New Roman" w:hAnsi="Times New Roman" w:cs="Times New Roman"/>
           <w:lang w:val="es-ES"/>
         </w:rPr>
-        <w:t xml:space="preserve"> para la opción #2: Tabla de símbolos.</w:t>
+        <w:t xml:space="preserve"> para la opción #2: </w:t>
+      </w:r>
+      <w:r>
+        <w:rPr>
+          <w:rFonts w:ascii="Times New Roman" w:hAnsi="Times New Roman" w:cs="Times New Roman"/>
+          <w:lang w:val="es-ES"/>
+        </w:rPr>
+        <w:t>Análisis sintáctico, semántico y t</w:t>
+      </w:r>
+      <w:r>
+        <w:rPr>
+          <w:rFonts w:ascii="Times New Roman" w:hAnsi="Times New Roman" w:cs="Times New Roman"/>
+          <w:lang w:val="es-ES"/>
+        </w:rPr>
+        <w:t>abla de símbolos.</w:t>
       </w:r>
     </w:p>
     <w:p>
@@ -2508,15 +2633,25 @@
           <w:lang w:val="es-ES"/>
         </w:rPr>
       </w:pPr>
+    </w:p>
+    <w:p>
+      <w:pPr>
+        <w:pStyle w:val="Prrafodelista"/>
+        <w:ind w:left="360"/>
+        <w:rPr>
+          <w:rFonts w:ascii="Times New Roman" w:hAnsi="Times New Roman" w:cs="Times New Roman"/>
+          <w:lang w:val="es-ES"/>
+        </w:rPr>
+      </w:pPr>
       <w:r>
         <w:rPr>
           <w:noProof/>
         </w:rPr>
         <w:drawing>
-          <wp:inline distT="0" distB="0" distL="0" distR="0" wp14:anchorId="5D61EEBF" wp14:editId="201C2B06">
-            <wp:extent cx="4761815" cy="3752602"/>
-            <wp:effectExtent l="0" t="0" r="1270" b="635"/>
-            <wp:docPr id="1576341313" name="Imagen 1" descr="Texto&#10;&#10;El contenido generado por IA puede ser incorrecto."/>
+          <wp:inline distT="0" distB="0" distL="0" distR="0" wp14:anchorId="0B92F4BA" wp14:editId="1FC34BBB">
+            <wp:extent cx="3590925" cy="2964366"/>
+            <wp:effectExtent l="0" t="0" r="0" b="7620"/>
+            <wp:docPr id="458756648" name="Imagen 1" descr="Texto&#10;&#10;El contenido generado por IA puede ser incorrecto."/>
             <wp:cNvGraphicFramePr>
               <a:graphicFrameLocks xmlns:a="http://schemas.openxmlformats.org/drawingml/2006/main" noChangeAspect="1"/>
             </wp:cNvGraphicFramePr>
@@ -2524,32 +2659,23 @@
               <a:graphicData uri="http://schemas.openxmlformats.org/drawingml/2006/picture">
                 <pic:pic xmlns:pic="http://schemas.openxmlformats.org/drawingml/2006/picture">
                   <pic:nvPicPr>
-                    <pic:cNvPr id="1576341313" name="Imagen 1" descr="Texto&#10;&#10;El contenido generado por IA puede ser incorrecto."/>
+                    <pic:cNvPr id="458756648" name="Imagen 1" descr="Texto&#10;&#10;El contenido generado por IA puede ser incorrecto."/>
                     <pic:cNvPicPr/>
                   </pic:nvPicPr>
-                  <pic:blipFill rotWithShape="1">
+                  <pic:blipFill>
                     <a:blip r:embed="rId19"/>
-                    <a:srcRect b="15613"/>
                     <a:stretch>
                       <a:fillRect/>
                     </a:stretch>
                   </pic:blipFill>
-                  <pic:spPr bwMode="auto">
+                  <pic:spPr>
                     <a:xfrm>
                       <a:off x="0" y="0"/>
-                      <a:ext cx="4774418" cy="3762534"/>
+                      <a:ext cx="3607380" cy="2977950"/>
                     </a:xfrm>
                     <a:prstGeom prst="rect">
                       <a:avLst/>
                     </a:prstGeom>
-                    <a:ln>
-                      <a:noFill/>
-                    </a:ln>
-                    <a:extLst>
-                      <a:ext uri="{53640926-AAD7-44D8-BBD7-CCE9431645EC}">
-                        <a14:shadowObscured xmlns:a14="http://schemas.microsoft.com/office/drawing/2010/main"/>
-                      </a:ext>
-                    </a:extLst>
                   </pic:spPr>
                 </pic:pic>
               </a:graphicData>
@@ -2570,6 +2696,14 @@
     </w:p>
     <w:p>
       <w:pPr>
+        <w:rPr>
+          <w:rFonts w:ascii="Times New Roman" w:hAnsi="Times New Roman" w:cs="Times New Roman"/>
+          <w:lang w:val="es-ES"/>
+        </w:rPr>
+      </w:pPr>
+    </w:p>
+    <w:p>
+      <w:pPr>
         <w:pStyle w:val="Prrafodelista"/>
         <w:ind w:left="360"/>
         <w:rPr>
@@ -2577,15 +2711,62 @@
           <w:lang w:val="es-ES"/>
         </w:rPr>
       </w:pPr>
+    </w:p>
+    <w:p>
+      <w:pPr>
+        <w:pStyle w:val="Prrafodelista"/>
+        <w:ind w:left="360"/>
+        <w:rPr>
+          <w:rFonts w:ascii="Times New Roman" w:hAnsi="Times New Roman" w:cs="Times New Roman"/>
+          <w:lang w:val="es-ES"/>
+        </w:rPr>
+      </w:pPr>
+    </w:p>
+    <w:p>
+      <w:pPr>
+        <w:pStyle w:val="Prrafodelista"/>
+        <w:ind w:left="360"/>
+        <w:rPr>
+          <w:rFonts w:ascii="Times New Roman" w:hAnsi="Times New Roman" w:cs="Times New Roman"/>
+          <w:lang w:val="es-ES"/>
+        </w:rPr>
+      </w:pPr>
+      <w:r>
+        <w:rPr>
+          <w:rFonts w:ascii="Times New Roman" w:hAnsi="Times New Roman" w:cs="Times New Roman"/>
+          <w:lang w:val="es-ES"/>
+        </w:rPr>
+        <w:t>Resultado esperado para la opción #3: Árbol sintáctico.</w:t>
+      </w:r>
+    </w:p>
+    <w:p>
+      <w:pPr>
+        <w:pStyle w:val="Prrafodelista"/>
+        <w:ind w:left="360"/>
+        <w:rPr>
+          <w:rFonts w:ascii="Times New Roman" w:hAnsi="Times New Roman" w:cs="Times New Roman"/>
+          <w:lang w:val="es-ES"/>
+        </w:rPr>
+      </w:pPr>
+    </w:p>
+    <w:p>
+      <w:pPr>
+        <w:pStyle w:val="Prrafodelista"/>
+        <w:ind w:left="360"/>
+        <w:rPr>
+          <w:rFonts w:ascii="Times New Roman" w:hAnsi="Times New Roman" w:cs="Times New Roman"/>
+          <w:lang w:val="es-ES"/>
+        </w:rPr>
+      </w:pPr>
       <w:r>
         <w:rPr>
           <w:noProof/>
         </w:rPr>
         <w:drawing>
-          <wp:inline distT="0" distB="0" distL="0" distR="0" wp14:anchorId="6EE74071" wp14:editId="3E49F28C">
-            <wp:extent cx="4761230" cy="3161533"/>
-            <wp:effectExtent l="0" t="0" r="1270" b="1270"/>
-            <wp:docPr id="1929428857" name="Imagen 1" descr="Texto&#10;&#10;El contenido generado por IA puede ser incorrecto."/>
+          <wp:inline distT="0" distB="0" distL="0" distR="0" wp14:anchorId="71AB21BD" wp14:editId="1C55F56C">
+            <wp:extent cx="5293995" cy="2788397"/>
+            <wp:effectExtent l="0" t="0" r="1905" b="0"/>
+            <wp:docPr id="913161289" name="Imagen 1" descr="Texto&#10;&#10;El contenido generado por IA puede ser incorrecto."/>
             <wp:cNvGraphicFramePr>
               <a:graphicFrameLocks xmlns:a="http://schemas.openxmlformats.org/drawingml/2006/main" noChangeAspect="1"/>
             </wp:cNvGraphicFramePr>
@@ -2593,138 +2774,11 @@
               <a:graphicData uri="http://schemas.openxmlformats.org/drawingml/2006/picture">
                 <pic:pic xmlns:pic="http://schemas.openxmlformats.org/drawingml/2006/picture">
                   <pic:nvPicPr>
-                    <pic:cNvPr id="1929428857" name="Imagen 1" descr="Texto&#10;&#10;El contenido generado por IA puede ser incorrecto."/>
-                    <pic:cNvPicPr/>
-                  </pic:nvPicPr>
-                  <pic:blipFill rotWithShape="1">
-                    <a:blip r:embed="rId20"/>
-                    <a:srcRect t="2204" r="19893"/>
-                    <a:stretch>
-                      <a:fillRect/>
-                    </a:stretch>
-                  </pic:blipFill>
-                  <pic:spPr bwMode="auto">
-                    <a:xfrm>
-                      <a:off x="0" y="0"/>
-                      <a:ext cx="4761230" cy="3161533"/>
-                    </a:xfrm>
-                    <a:prstGeom prst="rect">
-                      <a:avLst/>
-                    </a:prstGeom>
-                    <a:ln>
-                      <a:noFill/>
-                    </a:ln>
-                    <a:extLst>
-                      <a:ext uri="{53640926-AAD7-44D8-BBD7-CCE9431645EC}">
-                        <a14:shadowObscured xmlns:a14="http://schemas.microsoft.com/office/drawing/2010/main"/>
-                      </a:ext>
-                    </a:extLst>
-                  </pic:spPr>
-                </pic:pic>
-              </a:graphicData>
-            </a:graphic>
-          </wp:inline>
-        </w:drawing>
-      </w:r>
-    </w:p>
-    <w:p>
-      <w:pPr>
-        <w:pStyle w:val="Prrafodelista"/>
-        <w:ind w:left="360"/>
-        <w:rPr>
-          <w:rFonts w:ascii="Times New Roman" w:hAnsi="Times New Roman" w:cs="Times New Roman"/>
-          <w:lang w:val="es-ES"/>
-        </w:rPr>
-      </w:pPr>
-    </w:p>
-    <w:p>
-      <w:pPr>
-        <w:pStyle w:val="Prrafodelista"/>
-        <w:ind w:left="360"/>
-        <w:rPr>
-          <w:rFonts w:ascii="Times New Roman" w:hAnsi="Times New Roman" w:cs="Times New Roman"/>
-          <w:lang w:val="es-ES"/>
-        </w:rPr>
-      </w:pPr>
-    </w:p>
-    <w:p>
-      <w:pPr>
-        <w:pStyle w:val="Prrafodelista"/>
-        <w:ind w:left="360"/>
-        <w:rPr>
-          <w:rFonts w:ascii="Times New Roman" w:hAnsi="Times New Roman" w:cs="Times New Roman"/>
-          <w:lang w:val="es-ES"/>
-        </w:rPr>
-      </w:pPr>
-    </w:p>
-    <w:p>
-      <w:pPr>
-        <w:pStyle w:val="Prrafodelista"/>
-        <w:ind w:left="360"/>
-        <w:rPr>
-          <w:rFonts w:ascii="Times New Roman" w:hAnsi="Times New Roman" w:cs="Times New Roman"/>
-          <w:lang w:val="es-ES"/>
-        </w:rPr>
-      </w:pPr>
-    </w:p>
-    <w:p>
-      <w:pPr>
-        <w:pStyle w:val="Prrafodelista"/>
-        <w:ind w:left="360"/>
-        <w:rPr>
-          <w:rFonts w:ascii="Times New Roman" w:hAnsi="Times New Roman" w:cs="Times New Roman"/>
-          <w:lang w:val="es-ES"/>
-        </w:rPr>
-      </w:pPr>
-      <w:r>
-        <w:rPr>
-          <w:rFonts w:ascii="Times New Roman" w:hAnsi="Times New Roman" w:cs="Times New Roman"/>
-          <w:lang w:val="es-ES"/>
-        </w:rPr>
-        <w:lastRenderedPageBreak/>
-        <w:t>Resultado esperado para la opción #3: Árbol sintáctico.</w:t>
-      </w:r>
-    </w:p>
-    <w:p>
-      <w:pPr>
-        <w:pStyle w:val="Prrafodelista"/>
-        <w:ind w:left="360"/>
-        <w:rPr>
-          <w:rFonts w:ascii="Times New Roman" w:hAnsi="Times New Roman" w:cs="Times New Roman"/>
-          <w:lang w:val="es-ES"/>
-        </w:rPr>
-      </w:pPr>
-    </w:p>
-    <w:p>
-      <w:pPr>
-        <w:pStyle w:val="Prrafodelista"/>
-        <w:ind w:left="360"/>
-        <w:rPr>
-          <w:rFonts w:ascii="Times New Roman" w:hAnsi="Times New Roman" w:cs="Times New Roman"/>
-          <w:lang w:val="es-ES"/>
-        </w:rPr>
-      </w:pPr>
-      <w:r>
-        <w:rPr>
-          <w:noProof/>
-        </w:rPr>
-        <w:drawing>
-          <wp:inline distT="0" distB="0" distL="0" distR="0" wp14:anchorId="292AA2AA" wp14:editId="40D5D67D">
-            <wp:extent cx="5294403" cy="3583338"/>
-            <wp:effectExtent l="0" t="0" r="1905" b="0"/>
-            <wp:docPr id="1150702209" name="Imagen 1" descr="Texto&#10;&#10;El contenido generado por IA puede ser incorrecto."/>
-            <wp:cNvGraphicFramePr>
-              <a:graphicFrameLocks xmlns:a="http://schemas.openxmlformats.org/drawingml/2006/main" noChangeAspect="1"/>
-            </wp:cNvGraphicFramePr>
-            <a:graphic xmlns:a="http://schemas.openxmlformats.org/drawingml/2006/main">
-              <a:graphicData uri="http://schemas.openxmlformats.org/drawingml/2006/picture">
-                <pic:pic xmlns:pic="http://schemas.openxmlformats.org/drawingml/2006/picture">
-                  <pic:nvPicPr>
-                    <pic:cNvPr id="1150702209" name="Imagen 1" descr="Texto&#10;&#10;El contenido generado por IA puede ser incorrecto."/>
+                    <pic:cNvPr id="913161289" name="Imagen 1" descr="Texto&#10;&#10;El contenido generado por IA puede ser incorrecto."/>
                     <pic:cNvPicPr/>
                   </pic:nvPicPr>
                   <pic:blipFill>
-                    <a:blip r:embed="rId21"/>
+                    <a:blip r:embed="rId20"/>
                     <a:stretch>
                       <a:fillRect/>
                     </a:stretch>
@@ -2732,7 +2786,7 @@
                   <pic:spPr>
                     <a:xfrm>
                       <a:off x="0" y="0"/>
-                      <a:ext cx="5302026" cy="3588497"/>
+                      <a:ext cx="5300468" cy="2791806"/>
                     </a:xfrm>
                     <a:prstGeom prst="rect">
                       <a:avLst/>
@@ -2784,7 +2838,7 @@
                     <pic:cNvPicPr/>
                   </pic:nvPicPr>
                   <pic:blipFill rotWithShape="1">
-                    <a:blip r:embed="rId22"/>
+                    <a:blip r:embed="rId21"/>
                     <a:srcRect r="10929"/>
                     <a:stretch>
                       <a:fillRect/>
@@ -2844,7 +2898,7 @@
                     <pic:cNvPicPr/>
                   </pic:nvPicPr>
                   <pic:blipFill rotWithShape="1">
-                    <a:blip r:embed="rId23"/>
+                    <a:blip r:embed="rId22"/>
                     <a:srcRect r="12887"/>
                     <a:stretch>
                       <a:fillRect/>
@@ -2913,7 +2967,7 @@
                     <pic:cNvPicPr/>
                   </pic:nvPicPr>
                   <pic:blipFill rotWithShape="1">
-                    <a:blip r:embed="rId24"/>
+                    <a:blip r:embed="rId23"/>
                     <a:srcRect r="12895"/>
                     <a:stretch>
                       <a:fillRect/>
@@ -3006,12 +3060,1001 @@
     <w:p>
       <w:pPr>
         <w:pStyle w:val="Prrafodelista"/>
+        <w:ind w:left="360"/>
+        <w:rPr>
+          <w:rFonts w:ascii="Times New Roman" w:hAnsi="Times New Roman" w:cs="Times New Roman"/>
+          <w:lang w:val="es-ES"/>
+        </w:rPr>
+      </w:pPr>
+      <w:r>
+        <w:rPr>
+          <w:rFonts w:ascii="Times New Roman" w:hAnsi="Times New Roman" w:cs="Times New Roman"/>
+          <w:lang w:val="es-ES"/>
+        </w:rPr>
+        <w:lastRenderedPageBreak/>
+        <w:t>Resultado esperado para la opción #</w:t>
+      </w:r>
+      <w:r>
+        <w:rPr>
+          <w:rFonts w:ascii="Times New Roman" w:hAnsi="Times New Roman" w:cs="Times New Roman"/>
+          <w:lang w:val="es-ES"/>
+        </w:rPr>
+        <w:t>4</w:t>
+      </w:r>
+      <w:r>
+        <w:rPr>
+          <w:rFonts w:ascii="Times New Roman" w:hAnsi="Times New Roman" w:cs="Times New Roman"/>
+          <w:lang w:val="es-ES"/>
+        </w:rPr>
+        <w:t xml:space="preserve">: </w:t>
+      </w:r>
+      <w:r>
+        <w:rPr>
+          <w:rFonts w:ascii="Times New Roman" w:hAnsi="Times New Roman" w:cs="Times New Roman"/>
+          <w:lang w:val="es-ES"/>
+        </w:rPr>
+        <w:t>Generación de código intermedio</w:t>
+      </w:r>
+      <w:r>
+        <w:rPr>
+          <w:rFonts w:ascii="Times New Roman" w:hAnsi="Times New Roman" w:cs="Times New Roman"/>
+          <w:lang w:val="es-ES"/>
+        </w:rPr>
+        <w:t>.</w:t>
+      </w:r>
+    </w:p>
+    <w:p>
+      <w:pPr>
+        <w:pStyle w:val="Prrafodelista"/>
+        <w:ind w:left="360"/>
+        <w:rPr>
+          <w:rFonts w:ascii="Times New Roman" w:hAnsi="Times New Roman" w:cs="Times New Roman"/>
+          <w:lang w:val="es-ES"/>
+        </w:rPr>
+      </w:pPr>
+    </w:p>
+    <w:p>
+      <w:pPr>
+        <w:pStyle w:val="Prrafodelista"/>
+        <w:ind w:left="360"/>
+        <w:rPr>
+          <w:rFonts w:ascii="Times New Roman" w:hAnsi="Times New Roman" w:cs="Times New Roman"/>
+          <w:lang w:val="es-ES"/>
+        </w:rPr>
+      </w:pPr>
+      <w:r>
+        <w:rPr>
+          <w:noProof/>
+        </w:rPr>
+        <w:drawing>
+          <wp:inline distT="0" distB="0" distL="0" distR="0" wp14:anchorId="3562E57B" wp14:editId="13E18C68">
+            <wp:extent cx="4828196" cy="4191990"/>
+            <wp:effectExtent l="0" t="0" r="0" b="0"/>
+            <wp:docPr id="646017983" name="Imagen 1" descr="Texto&#10;&#10;El contenido generado por IA puede ser incorrecto."/>
+            <wp:cNvGraphicFramePr>
+              <a:graphicFrameLocks xmlns:a="http://schemas.openxmlformats.org/drawingml/2006/main" noChangeAspect="1"/>
+            </wp:cNvGraphicFramePr>
+            <a:graphic xmlns:a="http://schemas.openxmlformats.org/drawingml/2006/main">
+              <a:graphicData uri="http://schemas.openxmlformats.org/drawingml/2006/picture">
+                <pic:pic xmlns:pic="http://schemas.openxmlformats.org/drawingml/2006/picture">
+                  <pic:nvPicPr>
+                    <pic:cNvPr id="646017983" name="Imagen 1" descr="Texto&#10;&#10;El contenido generado por IA puede ser incorrecto."/>
+                    <pic:cNvPicPr/>
+                  </pic:nvPicPr>
+                  <pic:blipFill>
+                    <a:blip r:embed="rId24"/>
+                    <a:stretch>
+                      <a:fillRect/>
+                    </a:stretch>
+                  </pic:blipFill>
+                  <pic:spPr>
+                    <a:xfrm>
+                      <a:off x="0" y="0"/>
+                      <a:ext cx="4832145" cy="4195418"/>
+                    </a:xfrm>
+                    <a:prstGeom prst="rect">
+                      <a:avLst/>
+                    </a:prstGeom>
+                  </pic:spPr>
+                </pic:pic>
+              </a:graphicData>
+            </a:graphic>
+          </wp:inline>
+        </w:drawing>
+      </w:r>
+    </w:p>
+    <w:p>
+      <w:pPr>
+        <w:pStyle w:val="Prrafodelista"/>
+        <w:ind w:left="360"/>
+        <w:rPr>
+          <w:noProof/>
+        </w:rPr>
+      </w:pPr>
+    </w:p>
+    <w:p>
+      <w:pPr>
+        <w:pStyle w:val="Prrafodelista"/>
+        <w:ind w:left="360"/>
+        <w:rPr>
+          <w:rFonts w:ascii="Times New Roman" w:hAnsi="Times New Roman" w:cs="Times New Roman"/>
+          <w:lang w:val="es-ES"/>
+        </w:rPr>
+      </w:pPr>
+      <w:r>
+        <w:rPr>
+          <w:noProof/>
+        </w:rPr>
+        <w:lastRenderedPageBreak/>
+        <w:drawing>
+          <wp:inline distT="0" distB="0" distL="0" distR="0" wp14:anchorId="18164307" wp14:editId="1FA9CC8A">
+            <wp:extent cx="4039058" cy="4274498"/>
+            <wp:effectExtent l="0" t="0" r="0" b="0"/>
+            <wp:docPr id="296276731" name="Imagen 1" descr="Texto&#10;&#10;El contenido generado por IA puede ser incorrecto."/>
+            <wp:cNvGraphicFramePr>
+              <a:graphicFrameLocks xmlns:a="http://schemas.openxmlformats.org/drawingml/2006/main" noChangeAspect="1"/>
+            </wp:cNvGraphicFramePr>
+            <a:graphic xmlns:a="http://schemas.openxmlformats.org/drawingml/2006/main">
+              <a:graphicData uri="http://schemas.openxmlformats.org/drawingml/2006/picture">
+                <pic:pic xmlns:pic="http://schemas.openxmlformats.org/drawingml/2006/picture">
+                  <pic:nvPicPr>
+                    <pic:cNvPr id="296276731" name="Imagen 1" descr="Texto&#10;&#10;El contenido generado por IA puede ser incorrecto."/>
+                    <pic:cNvPicPr/>
+                  </pic:nvPicPr>
+                  <pic:blipFill rotWithShape="1">
+                    <a:blip r:embed="rId25"/>
+                    <a:srcRect b="6749"/>
+                    <a:stretch>
+                      <a:fillRect/>
+                    </a:stretch>
+                  </pic:blipFill>
+                  <pic:spPr bwMode="auto">
+                    <a:xfrm>
+                      <a:off x="0" y="0"/>
+                      <a:ext cx="4041967" cy="4277577"/>
+                    </a:xfrm>
+                    <a:prstGeom prst="rect">
+                      <a:avLst/>
+                    </a:prstGeom>
+                    <a:ln>
+                      <a:noFill/>
+                    </a:ln>
+                    <a:extLst>
+                      <a:ext uri="{53640926-AAD7-44D8-BBD7-CCE9431645EC}">
+                        <a14:shadowObscured xmlns:a14="http://schemas.microsoft.com/office/drawing/2010/main"/>
+                      </a:ext>
+                    </a:extLst>
+                  </pic:spPr>
+                </pic:pic>
+              </a:graphicData>
+            </a:graphic>
+          </wp:inline>
+        </w:drawing>
+      </w:r>
+    </w:p>
+    <w:p>
+      <w:pPr>
+        <w:pStyle w:val="Prrafodelista"/>
+        <w:ind w:left="360"/>
+        <w:rPr>
+          <w:rFonts w:ascii="Times New Roman" w:hAnsi="Times New Roman" w:cs="Times New Roman"/>
+          <w:lang w:val="es-ES"/>
+        </w:rPr>
+      </w:pPr>
+    </w:p>
+    <w:p>
+      <w:pPr>
+        <w:pStyle w:val="Prrafodelista"/>
+        <w:ind w:left="360"/>
+        <w:rPr>
+          <w:rFonts w:ascii="Times New Roman" w:hAnsi="Times New Roman" w:cs="Times New Roman"/>
+          <w:lang w:val="es-ES"/>
+        </w:rPr>
+      </w:pPr>
+    </w:p>
+    <w:p>
+      <w:pPr>
+        <w:pStyle w:val="Prrafodelista"/>
+        <w:ind w:left="360"/>
+        <w:rPr>
+          <w:rFonts w:ascii="Times New Roman" w:hAnsi="Times New Roman" w:cs="Times New Roman"/>
+          <w:lang w:val="es-ES"/>
+        </w:rPr>
+      </w:pPr>
+    </w:p>
+    <w:p>
+      <w:pPr>
+        <w:pStyle w:val="Prrafodelista"/>
+        <w:ind w:left="0" w:firstLine="360"/>
+        <w:rPr>
+          <w:rFonts w:ascii="Times New Roman" w:hAnsi="Times New Roman" w:cs="Times New Roman"/>
+          <w:lang w:val="es-ES"/>
+        </w:rPr>
+      </w:pPr>
+      <w:r>
+        <w:rPr>
+          <w:rFonts w:ascii="Times New Roman" w:hAnsi="Times New Roman" w:cs="Times New Roman"/>
+          <w:lang w:val="es-ES"/>
+        </w:rPr>
+        <w:t>Resultado esperado para la opción #</w:t>
+      </w:r>
+      <w:r>
+        <w:rPr>
+          <w:rFonts w:ascii="Times New Roman" w:hAnsi="Times New Roman" w:cs="Times New Roman"/>
+          <w:lang w:val="es-ES"/>
+        </w:rPr>
+        <w:t>5</w:t>
+      </w:r>
+      <w:r>
+        <w:rPr>
+          <w:rFonts w:ascii="Times New Roman" w:hAnsi="Times New Roman" w:cs="Times New Roman"/>
+          <w:lang w:val="es-ES"/>
+        </w:rPr>
+        <w:t>: Generación de código</w:t>
+      </w:r>
+      <w:r>
+        <w:rPr>
+          <w:rFonts w:ascii="Times New Roman" w:hAnsi="Times New Roman" w:cs="Times New Roman"/>
+          <w:lang w:val="es-ES"/>
+        </w:rPr>
+        <w:t xml:space="preserve"> máquina</w:t>
+      </w:r>
+      <w:r>
+        <w:rPr>
+          <w:rFonts w:ascii="Times New Roman" w:hAnsi="Times New Roman" w:cs="Times New Roman"/>
+          <w:lang w:val="es-ES"/>
+        </w:rPr>
+        <w:t>.</w:t>
+      </w:r>
+    </w:p>
+    <w:p>
+      <w:pPr>
+        <w:pStyle w:val="Prrafodelista"/>
+        <w:ind w:left="0" w:firstLine="360"/>
+        <w:rPr>
+          <w:rFonts w:ascii="Times New Roman" w:hAnsi="Times New Roman" w:cs="Times New Roman"/>
+          <w:lang w:val="es-ES"/>
+        </w:rPr>
+      </w:pPr>
+    </w:p>
+    <w:p>
+      <w:pPr>
+        <w:pStyle w:val="Prrafodelista"/>
+        <w:ind w:left="0" w:firstLine="360"/>
+        <w:rPr>
+          <w:rFonts w:ascii="Times New Roman" w:hAnsi="Times New Roman" w:cs="Times New Roman"/>
+          <w:color w:val="0E2841" w:themeColor="text2"/>
+          <w:lang w:val="es-ES"/>
+        </w:rPr>
+      </w:pPr>
+      <w:r>
+        <w:rPr>
+          <w:rFonts w:ascii="Times New Roman" w:hAnsi="Times New Roman" w:cs="Times New Roman"/>
+          <w:color w:val="0E2841" w:themeColor="text2"/>
+          <w:lang w:val="es-ES"/>
+        </w:rPr>
+        <w:t>Al seleccionar la opción</w:t>
+      </w:r>
+    </w:p>
+    <w:p>
+      <w:pPr>
+        <w:pStyle w:val="Prrafodelista"/>
+        <w:ind w:left="0" w:firstLine="360"/>
+        <w:rPr>
+          <w:rFonts w:ascii="Times New Roman" w:hAnsi="Times New Roman" w:cs="Times New Roman"/>
+          <w:lang w:val="es-ES"/>
+        </w:rPr>
+      </w:pPr>
+      <w:r>
+        <w:rPr>
+          <w:noProof/>
+        </w:rPr>
+        <w:drawing>
+          <wp:inline distT="0" distB="0" distL="0" distR="0" wp14:anchorId="5989E66C" wp14:editId="22462DFE">
+            <wp:extent cx="5943600" cy="1657985"/>
+            <wp:effectExtent l="0" t="0" r="0" b="0"/>
+            <wp:docPr id="956267655" name="Imagen 1" descr="Texto&#10;&#10;El contenido generado por IA puede ser incorrecto."/>
+            <wp:cNvGraphicFramePr>
+              <a:graphicFrameLocks xmlns:a="http://schemas.openxmlformats.org/drawingml/2006/main" noChangeAspect="1"/>
+            </wp:cNvGraphicFramePr>
+            <a:graphic xmlns:a="http://schemas.openxmlformats.org/drawingml/2006/main">
+              <a:graphicData uri="http://schemas.openxmlformats.org/drawingml/2006/picture">
+                <pic:pic xmlns:pic="http://schemas.openxmlformats.org/drawingml/2006/picture">
+                  <pic:nvPicPr>
+                    <pic:cNvPr id="956267655" name="Imagen 1" descr="Texto&#10;&#10;El contenido generado por IA puede ser incorrecto."/>
+                    <pic:cNvPicPr/>
+                  </pic:nvPicPr>
+                  <pic:blipFill>
+                    <a:blip r:embed="rId26"/>
+                    <a:stretch>
+                      <a:fillRect/>
+                    </a:stretch>
+                  </pic:blipFill>
+                  <pic:spPr>
+                    <a:xfrm>
+                      <a:off x="0" y="0"/>
+                      <a:ext cx="5943600" cy="1657985"/>
+                    </a:xfrm>
+                    <a:prstGeom prst="rect">
+                      <a:avLst/>
+                    </a:prstGeom>
+                  </pic:spPr>
+                </pic:pic>
+              </a:graphicData>
+            </a:graphic>
+          </wp:inline>
+        </w:drawing>
+      </w:r>
+    </w:p>
+    <w:p>
+      <w:pPr>
+        <w:pStyle w:val="Prrafodelista"/>
+        <w:ind w:left="360"/>
+        <w:rPr>
+          <w:rFonts w:ascii="Times New Roman" w:hAnsi="Times New Roman" w:cs="Times New Roman"/>
+          <w:lang w:val="es-ES"/>
+        </w:rPr>
+      </w:pPr>
+    </w:p>
+    <w:p>
+      <w:pPr>
+        <w:pStyle w:val="Prrafodelista"/>
+        <w:ind w:left="360"/>
+        <w:rPr>
+          <w:rFonts w:ascii="Times New Roman" w:hAnsi="Times New Roman" w:cs="Times New Roman"/>
+          <w:lang w:val="es-ES"/>
+        </w:rPr>
+      </w:pPr>
+    </w:p>
+    <w:p>
+      <w:pPr>
+        <w:pStyle w:val="Prrafodelista"/>
+        <w:ind w:left="360"/>
+        <w:rPr>
+          <w:rFonts w:ascii="Times New Roman" w:hAnsi="Times New Roman" w:cs="Times New Roman"/>
+          <w:lang w:val="es-ES"/>
+        </w:rPr>
+      </w:pPr>
+      <w:r>
+        <w:rPr>
+          <w:rFonts w:ascii="Times New Roman" w:hAnsi="Times New Roman" w:cs="Times New Roman"/>
+          <w:lang w:val="es-ES"/>
+        </w:rPr>
+        <w:t>Archivo generado en código MIPS:</w:t>
+      </w:r>
+    </w:p>
+    <w:p>
+      <w:pPr>
+        <w:pStyle w:val="Prrafodelista"/>
+        <w:ind w:left="360"/>
+        <w:rPr>
+          <w:rFonts w:ascii="Times New Roman" w:hAnsi="Times New Roman" w:cs="Times New Roman"/>
+          <w:lang w:val="es-ES"/>
+        </w:rPr>
+      </w:pPr>
+      <w:r>
+        <w:rPr>
+          <w:noProof/>
+        </w:rPr>
+        <w:lastRenderedPageBreak/>
+        <w:drawing>
+          <wp:inline distT="0" distB="0" distL="0" distR="0" wp14:anchorId="1CD701D0" wp14:editId="0FC2C28B">
+            <wp:extent cx="5943600" cy="5184775"/>
+            <wp:effectExtent l="0" t="0" r="0" b="0"/>
+            <wp:docPr id="713904830" name="Imagen 1" descr="Texto&#10;&#10;El contenido generado por IA puede ser incorrecto."/>
+            <wp:cNvGraphicFramePr>
+              <a:graphicFrameLocks xmlns:a="http://schemas.openxmlformats.org/drawingml/2006/main" noChangeAspect="1"/>
+            </wp:cNvGraphicFramePr>
+            <a:graphic xmlns:a="http://schemas.openxmlformats.org/drawingml/2006/main">
+              <a:graphicData uri="http://schemas.openxmlformats.org/drawingml/2006/picture">
+                <pic:pic xmlns:pic="http://schemas.openxmlformats.org/drawingml/2006/picture">
+                  <pic:nvPicPr>
+                    <pic:cNvPr id="713904830" name="Imagen 1" descr="Texto&#10;&#10;El contenido generado por IA puede ser incorrecto."/>
+                    <pic:cNvPicPr/>
+                  </pic:nvPicPr>
+                  <pic:blipFill>
+                    <a:blip r:embed="rId27"/>
+                    <a:stretch>
+                      <a:fillRect/>
+                    </a:stretch>
+                  </pic:blipFill>
+                  <pic:spPr>
+                    <a:xfrm>
+                      <a:off x="0" y="0"/>
+                      <a:ext cx="5943600" cy="5184775"/>
+                    </a:xfrm>
+                    <a:prstGeom prst="rect">
+                      <a:avLst/>
+                    </a:prstGeom>
+                  </pic:spPr>
+                </pic:pic>
+              </a:graphicData>
+            </a:graphic>
+          </wp:inline>
+        </w:drawing>
+      </w:r>
+    </w:p>
+    <w:p>
+      <w:pPr>
+        <w:pStyle w:val="Prrafodelista"/>
+        <w:ind w:left="360"/>
+        <w:rPr>
+          <w:rFonts w:ascii="Times New Roman" w:hAnsi="Times New Roman" w:cs="Times New Roman"/>
+          <w:lang w:val="es-ES"/>
+        </w:rPr>
+      </w:pPr>
+    </w:p>
+    <w:p>
+      <w:pPr>
+        <w:pStyle w:val="Prrafodelista"/>
+        <w:ind w:left="360"/>
+        <w:rPr>
+          <w:rFonts w:ascii="Times New Roman" w:hAnsi="Times New Roman" w:cs="Times New Roman"/>
+          <w:lang w:val="es-ES"/>
+        </w:rPr>
+      </w:pPr>
+    </w:p>
+    <w:p>
+      <w:pPr>
+        <w:pStyle w:val="Prrafodelista"/>
         <w:numPr>
           <w:ilvl w:val="0"/>
           <w:numId w:val="4"/>
         </w:numPr>
         <w:rPr>
           <w:rFonts w:ascii="Times New Roman" w:hAnsi="Times New Roman" w:cs="Times New Roman"/>
+          <w:lang w:val="es-ES"/>
+        </w:rPr>
+      </w:pPr>
+      <w:r>
+        <w:rPr>
+          <w:rFonts w:ascii="Times New Roman" w:hAnsi="Times New Roman" w:cs="Times New Roman"/>
+          <w:lang w:val="es-ES"/>
+        </w:rPr>
+        <w:t>Ejecutar código máquina en MIPS</w:t>
+      </w:r>
+    </w:p>
+    <w:p>
+      <w:pPr>
+        <w:ind w:left="360"/>
+        <w:rPr>
+          <w:rFonts w:ascii="Times New Roman" w:hAnsi="Times New Roman" w:cs="Times New Roman"/>
+          <w:lang w:val="es-ES"/>
+        </w:rPr>
+      </w:pPr>
+      <w:r>
+        <w:rPr>
+          <w:rFonts w:ascii="Times New Roman" w:hAnsi="Times New Roman" w:cs="Times New Roman"/>
+          <w:lang w:val="es-ES"/>
+        </w:rPr>
+        <w:t xml:space="preserve">Los pasos para ejecutar el archivo generado </w:t>
+      </w:r>
+      <w:proofErr w:type="spellStart"/>
+      <w:r>
+        <w:rPr>
+          <w:rFonts w:ascii="Times New Roman" w:hAnsi="Times New Roman" w:cs="Times New Roman"/>
+          <w:lang w:val="es-ES"/>
+        </w:rPr>
+        <w:t>asm</w:t>
+      </w:r>
+      <w:proofErr w:type="spellEnd"/>
+      <w:r>
+        <w:rPr>
+          <w:rFonts w:ascii="Times New Roman" w:hAnsi="Times New Roman" w:cs="Times New Roman"/>
+          <w:lang w:val="es-ES"/>
+        </w:rPr>
+        <w:t xml:space="preserve"> son:</w:t>
+      </w:r>
+    </w:p>
+    <w:p>
+      <w:pPr>
+        <w:pStyle w:val="Prrafodelista"/>
+        <w:numPr>
+          <w:ilvl w:val="0"/>
+          <w:numId w:val="13"/>
+        </w:numPr>
+        <w:rPr>
+          <w:rFonts w:ascii="Times New Roman" w:hAnsi="Times New Roman" w:cs="Times New Roman"/>
+          <w:lang w:val="es-ES"/>
+        </w:rPr>
+      </w:pPr>
+      <w:r>
+        <w:rPr>
+          <w:rFonts w:ascii="Times New Roman" w:hAnsi="Times New Roman" w:cs="Times New Roman"/>
+          <w:lang w:val="es-ES"/>
+        </w:rPr>
+        <w:t>Abrir el programa e ir a “File”</w:t>
+      </w:r>
+    </w:p>
+    <w:p>
+      <w:pPr>
+        <w:ind w:firstLine="360"/>
+        <w:rPr>
+          <w:noProof/>
+        </w:rPr>
+      </w:pPr>
+      <w:r>
+        <w:rPr>
+          <w:noProof/>
+        </w:rPr>
+        <w:drawing>
+          <wp:inline distT="0" distB="0" distL="0" distR="0" wp14:anchorId="66EBC5A9" wp14:editId="6832E55A">
+            <wp:extent cx="4743450" cy="1057275"/>
+            <wp:effectExtent l="0" t="0" r="0" b="9525"/>
+            <wp:docPr id="636129423" name="Imagen 1" descr="Interfaz de usuario gráfica, Aplicación&#10;&#10;El contenido generado por IA puede ser incorrecto."/>
+            <wp:cNvGraphicFramePr>
+              <a:graphicFrameLocks xmlns:a="http://schemas.openxmlformats.org/drawingml/2006/main" noChangeAspect="1"/>
+            </wp:cNvGraphicFramePr>
+            <a:graphic xmlns:a="http://schemas.openxmlformats.org/drawingml/2006/main">
+              <a:graphicData uri="http://schemas.openxmlformats.org/drawingml/2006/picture">
+                <pic:pic xmlns:pic="http://schemas.openxmlformats.org/drawingml/2006/picture">
+                  <pic:nvPicPr>
+                    <pic:cNvPr id="636129423" name="Imagen 1" descr="Interfaz de usuario gráfica, Aplicación&#10;&#10;El contenido generado por IA puede ser incorrecto."/>
+                    <pic:cNvPicPr/>
+                  </pic:nvPicPr>
+                  <pic:blipFill>
+                    <a:blip r:embed="rId28"/>
+                    <a:stretch>
+                      <a:fillRect/>
+                    </a:stretch>
+                  </pic:blipFill>
+                  <pic:spPr>
+                    <a:xfrm>
+                      <a:off x="0" y="0"/>
+                      <a:ext cx="4743450" cy="1057275"/>
+                    </a:xfrm>
+                    <a:prstGeom prst="rect">
+                      <a:avLst/>
+                    </a:prstGeom>
+                  </pic:spPr>
+                </pic:pic>
+              </a:graphicData>
+            </a:graphic>
+          </wp:inline>
+        </w:drawing>
+      </w:r>
+    </w:p>
+    <w:p>
+      <w:pPr>
+        <w:ind w:firstLine="360"/>
+        <w:rPr>
+          <w:noProof/>
+        </w:rPr>
+      </w:pPr>
+    </w:p>
+    <w:p>
+      <w:pPr>
+        <w:ind w:firstLine="360"/>
+        <w:rPr>
+          <w:noProof/>
+        </w:rPr>
+      </w:pPr>
+    </w:p>
+    <w:p>
+      <w:pPr>
+        <w:pStyle w:val="Prrafodelista"/>
+        <w:numPr>
+          <w:ilvl w:val="0"/>
+          <w:numId w:val="13"/>
+        </w:numPr>
+        <w:rPr>
+          <w:rFonts w:ascii="Times New Roman" w:hAnsi="Times New Roman" w:cs="Times New Roman"/>
+          <w:lang w:val="es-ES"/>
+        </w:rPr>
+      </w:pPr>
+      <w:proofErr w:type="spellStart"/>
+      <w:r>
+        <w:rPr>
+          <w:rFonts w:ascii="Times New Roman" w:hAnsi="Times New Roman" w:cs="Times New Roman"/>
+          <w:lang w:val="es-ES"/>
+        </w:rPr>
+        <w:t>Clickear</w:t>
+      </w:r>
+      <w:proofErr w:type="spellEnd"/>
+      <w:r>
+        <w:rPr>
+          <w:rFonts w:ascii="Times New Roman" w:hAnsi="Times New Roman" w:cs="Times New Roman"/>
+          <w:lang w:val="es-ES"/>
+        </w:rPr>
+        <w:t xml:space="preserve"> la opción de Load File</w:t>
+      </w:r>
+    </w:p>
+    <w:p>
+      <w:pPr>
+        <w:pStyle w:val="Prrafodelista"/>
+        <w:rPr>
+          <w:rFonts w:ascii="Times New Roman" w:hAnsi="Times New Roman" w:cs="Times New Roman"/>
+          <w:lang w:val="es-ES"/>
+        </w:rPr>
+      </w:pPr>
+      <w:r>
+        <w:rPr>
+          <w:noProof/>
+        </w:rPr>
+        <w:drawing>
+          <wp:inline distT="0" distB="0" distL="0" distR="0" wp14:anchorId="1F87FF75" wp14:editId="17DBD36C">
+            <wp:extent cx="1905000" cy="1080655"/>
+            <wp:effectExtent l="0" t="0" r="0" b="5715"/>
+            <wp:docPr id="727003361" name="Imagen 1" descr="Interfaz de usuario gráfica, Texto, Aplicación&#10;&#10;El contenido generado por IA puede ser incorrecto."/>
+            <wp:cNvGraphicFramePr>
+              <a:graphicFrameLocks xmlns:a="http://schemas.openxmlformats.org/drawingml/2006/main" noChangeAspect="1"/>
+            </wp:cNvGraphicFramePr>
+            <a:graphic xmlns:a="http://schemas.openxmlformats.org/drawingml/2006/main">
+              <a:graphicData uri="http://schemas.openxmlformats.org/drawingml/2006/picture">
+                <pic:pic xmlns:pic="http://schemas.openxmlformats.org/drawingml/2006/picture">
+                  <pic:nvPicPr>
+                    <pic:cNvPr id="727003361" name="Imagen 1" descr="Interfaz de usuario gráfica, Texto, Aplicación&#10;&#10;El contenido generado por IA puede ser incorrecto."/>
+                    <pic:cNvPicPr/>
+                  </pic:nvPicPr>
+                  <pic:blipFill rotWithShape="1">
+                    <a:blip r:embed="rId29"/>
+                    <a:srcRect b="52923"/>
+                    <a:stretch>
+                      <a:fillRect/>
+                    </a:stretch>
+                  </pic:blipFill>
+                  <pic:spPr bwMode="auto">
+                    <a:xfrm>
+                      <a:off x="0" y="0"/>
+                      <a:ext cx="1905000" cy="1080655"/>
+                    </a:xfrm>
+                    <a:prstGeom prst="rect">
+                      <a:avLst/>
+                    </a:prstGeom>
+                    <a:ln>
+                      <a:noFill/>
+                    </a:ln>
+                    <a:extLst>
+                      <a:ext uri="{53640926-AAD7-44D8-BBD7-CCE9431645EC}">
+                        <a14:shadowObscured xmlns:a14="http://schemas.microsoft.com/office/drawing/2010/main"/>
+                      </a:ext>
+                    </a:extLst>
+                  </pic:spPr>
+                </pic:pic>
+              </a:graphicData>
+            </a:graphic>
+          </wp:inline>
+        </w:drawing>
+      </w:r>
+    </w:p>
+    <w:p>
+      <w:pPr>
+        <w:pStyle w:val="Prrafodelista"/>
+        <w:rPr>
+          <w:rFonts w:ascii="Times New Roman" w:hAnsi="Times New Roman" w:cs="Times New Roman"/>
+          <w:lang w:val="es-ES"/>
+        </w:rPr>
+      </w:pPr>
+    </w:p>
+    <w:p>
+      <w:pPr>
+        <w:pStyle w:val="Prrafodelista"/>
+        <w:numPr>
+          <w:ilvl w:val="0"/>
+          <w:numId w:val="13"/>
+        </w:numPr>
+        <w:rPr>
+          <w:rFonts w:ascii="Times New Roman" w:hAnsi="Times New Roman" w:cs="Times New Roman"/>
+          <w:lang w:val="es-ES"/>
+        </w:rPr>
+      </w:pPr>
+      <w:r>
+        <w:rPr>
+          <w:rFonts w:ascii="Times New Roman" w:hAnsi="Times New Roman" w:cs="Times New Roman"/>
+          <w:lang w:val="es-ES"/>
+        </w:rPr>
+        <w:t xml:space="preserve">Buscar el archivo </w:t>
+      </w:r>
+      <w:proofErr w:type="spellStart"/>
+      <w:r>
+        <w:rPr>
+          <w:rFonts w:ascii="Times New Roman" w:hAnsi="Times New Roman" w:cs="Times New Roman"/>
+          <w:lang w:val="es-ES"/>
+        </w:rPr>
+        <w:t>asm</w:t>
+      </w:r>
+      <w:proofErr w:type="spellEnd"/>
+      <w:r>
+        <w:rPr>
+          <w:rFonts w:ascii="Times New Roman" w:hAnsi="Times New Roman" w:cs="Times New Roman"/>
+          <w:lang w:val="es-ES"/>
+        </w:rPr>
+        <w:t xml:space="preserve"> en el directorio de archivos</w:t>
+      </w:r>
+    </w:p>
+    <w:p>
+      <w:pPr>
+        <w:pStyle w:val="Prrafodelista"/>
+        <w:rPr>
+          <w:rFonts w:ascii="Times New Roman" w:hAnsi="Times New Roman" w:cs="Times New Roman"/>
+          <w:lang w:val="es-ES"/>
+        </w:rPr>
+      </w:pPr>
+      <w:r>
+        <w:rPr>
+          <w:noProof/>
+        </w:rPr>
+        <w:drawing>
+          <wp:inline distT="0" distB="0" distL="0" distR="0" wp14:anchorId="609CBE2C" wp14:editId="59A8BB49">
+            <wp:extent cx="3241963" cy="2412427"/>
+            <wp:effectExtent l="0" t="0" r="0" b="6985"/>
+            <wp:docPr id="1239829405" name="Imagen 1" descr="Texto&#10;&#10;El contenido generado por IA puede ser incorrecto."/>
+            <wp:cNvGraphicFramePr>
+              <a:graphicFrameLocks xmlns:a="http://schemas.openxmlformats.org/drawingml/2006/main" noChangeAspect="1"/>
+            </wp:cNvGraphicFramePr>
+            <a:graphic xmlns:a="http://schemas.openxmlformats.org/drawingml/2006/main">
+              <a:graphicData uri="http://schemas.openxmlformats.org/drawingml/2006/picture">
+                <pic:pic xmlns:pic="http://schemas.openxmlformats.org/drawingml/2006/picture">
+                  <pic:nvPicPr>
+                    <pic:cNvPr id="1239829405" name="Imagen 1" descr="Texto&#10;&#10;El contenido generado por IA puede ser incorrecto."/>
+                    <pic:cNvPicPr/>
+                  </pic:nvPicPr>
+                  <pic:blipFill>
+                    <a:blip r:embed="rId30"/>
+                    <a:stretch>
+                      <a:fillRect/>
+                    </a:stretch>
+                  </pic:blipFill>
+                  <pic:spPr>
+                    <a:xfrm>
+                      <a:off x="0" y="0"/>
+                      <a:ext cx="3245032" cy="2414711"/>
+                    </a:xfrm>
+                    <a:prstGeom prst="rect">
+                      <a:avLst/>
+                    </a:prstGeom>
+                  </pic:spPr>
+                </pic:pic>
+              </a:graphicData>
+            </a:graphic>
+          </wp:inline>
+        </w:drawing>
+      </w:r>
+    </w:p>
+    <w:p>
+      <w:pPr>
+        <w:pStyle w:val="Prrafodelista"/>
+        <w:rPr>
+          <w:rFonts w:ascii="Times New Roman" w:hAnsi="Times New Roman" w:cs="Times New Roman"/>
+          <w:lang w:val="es-ES"/>
+        </w:rPr>
+      </w:pPr>
+    </w:p>
+    <w:p>
+      <w:pPr>
+        <w:pStyle w:val="Prrafodelista"/>
+        <w:numPr>
+          <w:ilvl w:val="0"/>
+          <w:numId w:val="13"/>
+        </w:numPr>
+        <w:rPr>
+          <w:rFonts w:ascii="Times New Roman" w:hAnsi="Times New Roman" w:cs="Times New Roman"/>
+          <w:lang w:val="es-ES"/>
+        </w:rPr>
+      </w:pPr>
+      <w:r>
+        <w:rPr>
+          <w:rFonts w:ascii="Times New Roman" w:hAnsi="Times New Roman" w:cs="Times New Roman"/>
+          <w:lang w:val="es-ES"/>
+        </w:rPr>
+        <w:t>Ya cargado el archivo se presiona en Run/Continue y se ejecuta el código</w:t>
+      </w:r>
+    </w:p>
+    <w:p>
+      <w:pPr>
+        <w:pStyle w:val="Prrafodelista"/>
+        <w:rPr>
+          <w:rFonts w:ascii="Times New Roman" w:hAnsi="Times New Roman" w:cs="Times New Roman"/>
+          <w:lang w:val="es-ES"/>
+        </w:rPr>
+      </w:pPr>
+    </w:p>
+    <w:p>
+      <w:pPr>
+        <w:pStyle w:val="Prrafodelista"/>
+        <w:rPr>
+          <w:rFonts w:ascii="Times New Roman" w:hAnsi="Times New Roman" w:cs="Times New Roman"/>
+          <w:lang w:val="es-ES"/>
+        </w:rPr>
+      </w:pPr>
+      <w:r>
+        <w:rPr>
+          <w:noProof/>
+        </w:rPr>
+        <w:drawing>
+          <wp:inline distT="0" distB="0" distL="0" distR="0" wp14:anchorId="7D8C0A93" wp14:editId="0910E4C0">
+            <wp:extent cx="2924175" cy="1400175"/>
+            <wp:effectExtent l="0" t="0" r="9525" b="9525"/>
+            <wp:docPr id="862673544" name="Imagen 1" descr="Interfaz de usuario gráfica&#10;&#10;El contenido generado por IA puede ser incorrecto."/>
+            <wp:cNvGraphicFramePr>
+              <a:graphicFrameLocks xmlns:a="http://schemas.openxmlformats.org/drawingml/2006/main" noChangeAspect="1"/>
+            </wp:cNvGraphicFramePr>
+            <a:graphic xmlns:a="http://schemas.openxmlformats.org/drawingml/2006/main">
+              <a:graphicData uri="http://schemas.openxmlformats.org/drawingml/2006/picture">
+                <pic:pic xmlns:pic="http://schemas.openxmlformats.org/drawingml/2006/picture">
+                  <pic:nvPicPr>
+                    <pic:cNvPr id="862673544" name="Imagen 1" descr="Interfaz de usuario gráfica&#10;&#10;El contenido generado por IA puede ser incorrecto."/>
+                    <pic:cNvPicPr/>
+                  </pic:nvPicPr>
+                  <pic:blipFill>
+                    <a:blip r:embed="rId31"/>
+                    <a:stretch>
+                      <a:fillRect/>
+                    </a:stretch>
+                  </pic:blipFill>
+                  <pic:spPr>
+                    <a:xfrm>
+                      <a:off x="0" y="0"/>
+                      <a:ext cx="2924175" cy="1400175"/>
+                    </a:xfrm>
+                    <a:prstGeom prst="rect">
+                      <a:avLst/>
+                    </a:prstGeom>
+                  </pic:spPr>
+                </pic:pic>
+              </a:graphicData>
+            </a:graphic>
+          </wp:inline>
+        </w:drawing>
+      </w:r>
+    </w:p>
+    <w:p>
+      <w:pPr>
+        <w:pStyle w:val="Prrafodelista"/>
+        <w:rPr>
+          <w:rFonts w:ascii="Times New Roman" w:hAnsi="Times New Roman" w:cs="Times New Roman"/>
+          <w:lang w:val="es-ES"/>
+        </w:rPr>
+      </w:pPr>
+    </w:p>
+    <w:p>
+      <w:pPr>
+        <w:pStyle w:val="Prrafodelista"/>
+        <w:rPr>
+          <w:rFonts w:ascii="Times New Roman" w:hAnsi="Times New Roman" w:cs="Times New Roman"/>
+          <w:lang w:val="es-ES"/>
+        </w:rPr>
+      </w:pPr>
+    </w:p>
+    <w:p>
+      <w:pPr>
+        <w:pStyle w:val="Prrafodelista"/>
+        <w:ind w:left="360"/>
+        <w:rPr>
+          <w:rFonts w:ascii="Times New Roman" w:hAnsi="Times New Roman" w:cs="Times New Roman"/>
+          <w:lang w:val="es-ES"/>
+        </w:rPr>
+      </w:pPr>
+      <w:r>
+        <w:rPr>
+          <w:rFonts w:ascii="Times New Roman" w:hAnsi="Times New Roman" w:cs="Times New Roman"/>
+          <w:lang w:val="es-ES"/>
+        </w:rPr>
+        <w:t>Extra: En caso de recibir un error se recomienda limpiar</w:t>
+      </w:r>
+      <w:r>
+        <w:rPr>
+          <w:rFonts w:ascii="Times New Roman" w:hAnsi="Times New Roman" w:cs="Times New Roman"/>
+          <w:lang w:val="es-ES"/>
+        </w:rPr>
+        <w:t xml:space="preserve"> los registros y reiniciar el simulador</w:t>
+      </w:r>
+    </w:p>
+    <w:p>
+      <w:pPr>
+        <w:pStyle w:val="Prrafodelista"/>
+        <w:ind w:left="360"/>
+        <w:rPr>
+          <w:rFonts w:ascii="Times New Roman" w:hAnsi="Times New Roman" w:cs="Times New Roman"/>
+          <w:lang w:val="es-ES"/>
+        </w:rPr>
+      </w:pPr>
+    </w:p>
+    <w:p>
+      <w:pPr>
+        <w:pStyle w:val="Prrafodelista"/>
+        <w:ind w:left="360"/>
+        <w:rPr>
+          <w:rFonts w:ascii="Times New Roman" w:hAnsi="Times New Roman" w:cs="Times New Roman"/>
+          <w:lang w:val="es-ES"/>
+        </w:rPr>
+      </w:pPr>
+      <w:r>
+        <w:rPr>
+          <w:noProof/>
+        </w:rPr>
+        <w:drawing>
+          <wp:inline distT="0" distB="0" distL="0" distR="0" wp14:anchorId="129E11AF" wp14:editId="385ACD96">
+            <wp:extent cx="1564749" cy="760021"/>
+            <wp:effectExtent l="0" t="0" r="0" b="2540"/>
+            <wp:docPr id="1896856950" name="Imagen 1" descr="Calendario&#10;&#10;El contenido generado por IA puede ser incorrecto."/>
+            <wp:cNvGraphicFramePr>
+              <a:graphicFrameLocks xmlns:a="http://schemas.openxmlformats.org/drawingml/2006/main" noChangeAspect="1"/>
+            </wp:cNvGraphicFramePr>
+            <a:graphic xmlns:a="http://schemas.openxmlformats.org/drawingml/2006/main">
+              <a:graphicData uri="http://schemas.openxmlformats.org/drawingml/2006/picture">
+                <pic:pic xmlns:pic="http://schemas.openxmlformats.org/drawingml/2006/picture">
+                  <pic:nvPicPr>
+                    <pic:cNvPr id="1896856950" name="Imagen 1" descr="Calendario&#10;&#10;El contenido generado por IA puede ser incorrecto."/>
+                    <pic:cNvPicPr/>
+                  </pic:nvPicPr>
+                  <pic:blipFill>
+                    <a:blip r:embed="rId32"/>
+                    <a:stretch>
+                      <a:fillRect/>
+                    </a:stretch>
+                  </pic:blipFill>
+                  <pic:spPr>
+                    <a:xfrm>
+                      <a:off x="0" y="0"/>
+                      <a:ext cx="1570454" cy="762792"/>
+                    </a:xfrm>
+                    <a:prstGeom prst="rect">
+                      <a:avLst/>
+                    </a:prstGeom>
+                  </pic:spPr>
+                </pic:pic>
+              </a:graphicData>
+            </a:graphic>
+          </wp:inline>
+        </w:drawing>
+      </w:r>
+      <w:r>
+        <w:rPr>
+          <w:noProof/>
+        </w:rPr>
+        <w:t xml:space="preserve"> </w:t>
+      </w:r>
+      <w:r>
+        <w:rPr>
+          <w:noProof/>
+        </w:rPr>
+        <w:drawing>
+          <wp:inline distT="0" distB="0" distL="0" distR="0" wp14:anchorId="49CF35B7" wp14:editId="7280A8B9">
+            <wp:extent cx="1781175" cy="800100"/>
+            <wp:effectExtent l="0" t="0" r="9525" b="0"/>
+            <wp:docPr id="1025778205" name="Imagen 1" descr="Imagen que contiene Gráfico&#10;&#10;El contenido generado por IA puede ser incorrecto."/>
+            <wp:cNvGraphicFramePr>
+              <a:graphicFrameLocks xmlns:a="http://schemas.openxmlformats.org/drawingml/2006/main" noChangeAspect="1"/>
+            </wp:cNvGraphicFramePr>
+            <a:graphic xmlns:a="http://schemas.openxmlformats.org/drawingml/2006/main">
+              <a:graphicData uri="http://schemas.openxmlformats.org/drawingml/2006/picture">
+                <pic:pic xmlns:pic="http://schemas.openxmlformats.org/drawingml/2006/picture">
+                  <pic:nvPicPr>
+                    <pic:cNvPr id="1025778205" name="Imagen 1" descr="Imagen que contiene Gráfico&#10;&#10;El contenido generado por IA puede ser incorrecto."/>
+                    <pic:cNvPicPr/>
+                  </pic:nvPicPr>
+                  <pic:blipFill>
+                    <a:blip r:embed="rId33"/>
+                    <a:stretch>
+                      <a:fillRect/>
+                    </a:stretch>
+                  </pic:blipFill>
+                  <pic:spPr>
+                    <a:xfrm>
+                      <a:off x="0" y="0"/>
+                      <a:ext cx="1781175" cy="800100"/>
+                    </a:xfrm>
+                    <a:prstGeom prst="rect">
+                      <a:avLst/>
+                    </a:prstGeom>
+                  </pic:spPr>
+                </pic:pic>
+              </a:graphicData>
+            </a:graphic>
+          </wp:inline>
+        </w:drawing>
+      </w:r>
+    </w:p>
+    <w:p>
+      <w:pPr>
+        <w:pStyle w:val="Prrafodelista"/>
+        <w:numPr>
+          <w:ilvl w:val="0"/>
+          <w:numId w:val="4"/>
+        </w:numPr>
+        <w:rPr>
+          <w:rFonts w:ascii="Times New Roman" w:hAnsi="Times New Roman" w:cs="Times New Roman"/>
           <w:b/>
           <w:bCs/>
           <w:lang w:val="es-ES"/>
@@ -3161,6 +4204,243 @@
           <w:lang w:val="es-ES"/>
         </w:rPr>
         <w:t xml:space="preserve"> cuando encuentra un error de sentencia, para que se siga imprimiendo el árbol o la tabla sin problemas.</w:t>
+      </w:r>
+      <w:r>
+        <w:rPr>
+          <w:rFonts w:ascii="Times New Roman" w:hAnsi="Times New Roman" w:cs="Times New Roman"/>
+          <w:lang w:val="es-ES"/>
+        </w:rPr>
+        <w:t xml:space="preserve"> </w:t>
+      </w:r>
+      <w:r>
+        <w:rPr>
+          <w:rFonts w:ascii="Times New Roman" w:hAnsi="Times New Roman" w:cs="Times New Roman"/>
+          <w:lang w:val="es-ES"/>
+        </w:rPr>
+        <w:t>Este manejo de errores se mejoró gracias al análisis semántico, que ahora indica</w:t>
+      </w:r>
+      <w:r>
+        <w:rPr>
+          <w:rFonts w:ascii="Times New Roman" w:hAnsi="Times New Roman" w:cs="Times New Roman"/>
+          <w:lang w:val="es-ES"/>
+        </w:rPr>
+        <w:t xml:space="preserve"> errores que no solo van en contra de la gramática sino a un uso incorrecto del significado del programa, </w:t>
+      </w:r>
+      <w:r>
+        <w:rPr>
+          <w:rFonts w:ascii="Times New Roman" w:hAnsi="Times New Roman" w:cs="Times New Roman"/>
+          <w:lang w:val="es-ES"/>
+        </w:rPr>
+        <w:t xml:space="preserve">como variables no declaradas, tipos incompatibles, retornos </w:t>
+      </w:r>
+      <w:r>
+        <w:rPr>
+          <w:rFonts w:ascii="Times New Roman" w:hAnsi="Times New Roman" w:cs="Times New Roman"/>
+          <w:u w:val="single"/>
+          <w:lang w:val="es-ES"/>
+        </w:rPr>
+        <w:t>inválidos</w:t>
+      </w:r>
+      <w:r>
+        <w:rPr>
+          <w:rFonts w:ascii="Times New Roman" w:hAnsi="Times New Roman" w:cs="Times New Roman"/>
+          <w:lang w:val="es-ES"/>
+        </w:rPr>
+        <w:t xml:space="preserve"> y llamadas a funciones con parámetros incorrectos</w:t>
+      </w:r>
+      <w:r>
+        <w:rPr>
+          <w:rFonts w:ascii="Times New Roman" w:hAnsi="Times New Roman" w:cs="Times New Roman"/>
+          <w:lang w:val="es-ES"/>
+        </w:rPr>
+        <w:t>.</w:t>
+      </w:r>
+    </w:p>
+    <w:p>
+      <w:pPr>
+        <w:pStyle w:val="Prrafodelista"/>
+        <w:ind w:left="360"/>
+        <w:rPr>
+          <w:rFonts w:ascii="Times New Roman" w:hAnsi="Times New Roman" w:cs="Times New Roman"/>
+          <w:lang w:val="es-ES"/>
+        </w:rPr>
+      </w:pPr>
+    </w:p>
+    <w:p>
+      <w:pPr>
+        <w:pStyle w:val="Prrafodelista"/>
+        <w:ind w:left="360"/>
+        <w:rPr>
+          <w:rFonts w:ascii="Times New Roman" w:hAnsi="Times New Roman" w:cs="Times New Roman"/>
+          <w:lang w:val="es-ES"/>
+        </w:rPr>
+      </w:pPr>
+      <w:r>
+        <w:rPr>
+          <w:rFonts w:ascii="Times New Roman" w:hAnsi="Times New Roman" w:cs="Times New Roman"/>
+          <w:lang w:val="es-ES"/>
+        </w:rPr>
+        <w:t>Manejo de errores semánticos</w:t>
+      </w:r>
+    </w:p>
+    <w:p>
+      <w:pPr>
+        <w:pStyle w:val="Prrafodelista"/>
+        <w:ind w:left="360"/>
+        <w:rPr>
+          <w:rFonts w:ascii="Times New Roman" w:hAnsi="Times New Roman" w:cs="Times New Roman"/>
+          <w:lang w:val="es-ES"/>
+        </w:rPr>
+      </w:pPr>
+    </w:p>
+    <w:p>
+      <w:pPr>
+        <w:pStyle w:val="Prrafodelista"/>
+        <w:ind w:left="360"/>
+        <w:rPr>
+          <w:rFonts w:ascii="Times New Roman" w:hAnsi="Times New Roman" w:cs="Times New Roman"/>
+          <w:lang w:val="es-ES"/>
+        </w:rPr>
+      </w:pPr>
+      <w:r>
+        <w:rPr>
+          <w:noProof/>
+        </w:rPr>
+        <w:drawing>
+          <wp:inline distT="0" distB="0" distL="0" distR="0" wp14:anchorId="7DFFB503" wp14:editId="6CCDBAB6">
+            <wp:extent cx="5943600" cy="2741930"/>
+            <wp:effectExtent l="0" t="0" r="0" b="1270"/>
+            <wp:docPr id="1816151742" name="Imagen 1"/>
+            <wp:cNvGraphicFramePr>
+              <a:graphicFrameLocks xmlns:a="http://schemas.openxmlformats.org/drawingml/2006/main" noChangeAspect="1"/>
+            </wp:cNvGraphicFramePr>
+            <a:graphic xmlns:a="http://schemas.openxmlformats.org/drawingml/2006/main">
+              <a:graphicData uri="http://schemas.openxmlformats.org/drawingml/2006/picture">
+                <pic:pic xmlns:pic="http://schemas.openxmlformats.org/drawingml/2006/picture">
+                  <pic:nvPicPr>
+                    <pic:cNvPr id="1816151742" name=""/>
+                    <pic:cNvPicPr/>
+                  </pic:nvPicPr>
+                  <pic:blipFill>
+                    <a:blip r:embed="rId34"/>
+                    <a:stretch>
+                      <a:fillRect/>
+                    </a:stretch>
+                  </pic:blipFill>
+                  <pic:spPr>
+                    <a:xfrm>
+                      <a:off x="0" y="0"/>
+                      <a:ext cx="5943600" cy="2741930"/>
+                    </a:xfrm>
+                    <a:prstGeom prst="rect">
+                      <a:avLst/>
+                    </a:prstGeom>
+                  </pic:spPr>
+                </pic:pic>
+              </a:graphicData>
+            </a:graphic>
+          </wp:inline>
+        </w:drawing>
+      </w:r>
+    </w:p>
+    <w:p>
+      <w:pPr>
+        <w:pStyle w:val="Prrafodelista"/>
+        <w:ind w:left="360"/>
+        <w:rPr>
+          <w:rFonts w:ascii="Times New Roman" w:hAnsi="Times New Roman" w:cs="Times New Roman"/>
+          <w:lang w:val="es-ES"/>
+        </w:rPr>
+      </w:pPr>
+    </w:p>
+    <w:p>
+      <w:pPr>
+        <w:pStyle w:val="Prrafodelista"/>
+        <w:ind w:left="360"/>
+        <w:rPr>
+          <w:rFonts w:ascii="Times New Roman" w:hAnsi="Times New Roman" w:cs="Times New Roman"/>
+          <w:lang w:val="es-ES"/>
+        </w:rPr>
+      </w:pPr>
+      <w:r>
+        <w:rPr>
+          <w:noProof/>
+        </w:rPr>
+        <w:lastRenderedPageBreak/>
+        <w:drawing>
+          <wp:inline distT="0" distB="0" distL="0" distR="0" wp14:anchorId="22F6FADF" wp14:editId="1DBA443A">
+            <wp:extent cx="5943600" cy="3684270"/>
+            <wp:effectExtent l="0" t="0" r="0" b="0"/>
+            <wp:docPr id="635181247" name="Imagen 1" descr="Texto&#10;&#10;El contenido generado por IA puede ser incorrecto."/>
+            <wp:cNvGraphicFramePr>
+              <a:graphicFrameLocks xmlns:a="http://schemas.openxmlformats.org/drawingml/2006/main" noChangeAspect="1"/>
+            </wp:cNvGraphicFramePr>
+            <a:graphic xmlns:a="http://schemas.openxmlformats.org/drawingml/2006/main">
+              <a:graphicData uri="http://schemas.openxmlformats.org/drawingml/2006/picture">
+                <pic:pic xmlns:pic="http://schemas.openxmlformats.org/drawingml/2006/picture">
+                  <pic:nvPicPr>
+                    <pic:cNvPr id="635181247" name="Imagen 1" descr="Texto&#10;&#10;El contenido generado por IA puede ser incorrecto."/>
+                    <pic:cNvPicPr/>
+                  </pic:nvPicPr>
+                  <pic:blipFill>
+                    <a:blip r:embed="rId35"/>
+                    <a:stretch>
+                      <a:fillRect/>
+                    </a:stretch>
+                  </pic:blipFill>
+                  <pic:spPr>
+                    <a:xfrm>
+                      <a:off x="0" y="0"/>
+                      <a:ext cx="5943600" cy="3684270"/>
+                    </a:xfrm>
+                    <a:prstGeom prst="rect">
+                      <a:avLst/>
+                    </a:prstGeom>
+                  </pic:spPr>
+                </pic:pic>
+              </a:graphicData>
+            </a:graphic>
+          </wp:inline>
+        </w:drawing>
+      </w:r>
+    </w:p>
+    <w:p>
+      <w:pPr>
+        <w:pStyle w:val="Prrafodelista"/>
+        <w:ind w:left="360"/>
+        <w:rPr>
+          <w:rFonts w:ascii="Times New Roman" w:hAnsi="Times New Roman" w:cs="Times New Roman"/>
+          <w:lang w:val="es-ES"/>
+        </w:rPr>
+      </w:pPr>
+    </w:p>
+    <w:p>
+      <w:pPr>
+        <w:pStyle w:val="Prrafodelista"/>
+        <w:ind w:left="360"/>
+        <w:rPr>
+          <w:rFonts w:ascii="Times New Roman" w:hAnsi="Times New Roman" w:cs="Times New Roman"/>
+          <w:lang w:val="es-ES"/>
+        </w:rPr>
+      </w:pPr>
+    </w:p>
+    <w:p>
+      <w:pPr>
+        <w:pStyle w:val="Prrafodelista"/>
+        <w:ind w:left="360"/>
+        <w:rPr>
+          <w:rFonts w:ascii="Times New Roman" w:hAnsi="Times New Roman" w:cs="Times New Roman"/>
+          <w:color w:val="0E2841" w:themeColor="text2"/>
+          <w:lang w:val="es-ES"/>
+        </w:rPr>
+      </w:pPr>
+      <w:r>
+        <w:rPr>
+          <w:rFonts w:ascii="Times New Roman" w:hAnsi="Times New Roman" w:cs="Times New Roman"/>
+          <w:color w:val="0E2841" w:themeColor="text2"/>
+          <w:lang w:val="es-ES"/>
+        </w:rPr>
+        <w:t>Manejo de errores en árbol sintáctico (Proyecto #2)</w:t>
       </w:r>
     </w:p>
     <w:p>
@@ -3202,7 +4482,7 @@
                     <pic:cNvPicPr/>
                   </pic:nvPicPr>
                   <pic:blipFill rotWithShape="1">
-                    <a:blip r:embed="rId25"/>
+                    <a:blip r:embed="rId36"/>
                     <a:srcRect r="32467"/>
                     <a:stretch>
                       <a:fillRect/>
@@ -3255,6 +4535,7 @@
         <w:rPr>
           <w:noProof/>
         </w:rPr>
+        <w:lastRenderedPageBreak/>
         <w:drawing>
           <wp:inline distT="0" distB="0" distL="0" distR="0" wp14:anchorId="676B462A" wp14:editId="472A942D">
             <wp:extent cx="4678878" cy="2881809"/>
@@ -3271,7 +4552,7 @@
                     <pic:cNvPicPr/>
                   </pic:nvPicPr>
                   <pic:blipFill>
-                    <a:blip r:embed="rId26"/>
+                    <a:blip r:embed="rId37"/>
                     <a:stretch>
                       <a:fillRect/>
                     </a:stretch>
@@ -3825,6 +5106,95 @@
     </w:lvl>
   </w:abstractNum>
   <w:abstractNum w:abstractNumId="5" w15:restartNumberingAfterBreak="0">
+    <w:nsid w:val="25502996"/>
+    <w:multiLevelType w:val="hybridMultilevel"/>
+    <w:tmpl w:val="08CCCF84"/>
+    <w:lvl w:ilvl="0" w:tplc="04090011">
+      <w:start w:val="1"/>
+      <w:numFmt w:val="decimal"/>
+      <w:lvlText w:val="%1)"/>
+      <w:lvlJc w:val="left"/>
+      <w:pPr>
+        <w:ind w:left="720" w:hanging="360"/>
+      </w:pPr>
+      <w:rPr>
+        <w:rFonts w:hint="default"/>
+      </w:rPr>
+    </w:lvl>
+    <w:lvl w:ilvl="1" w:tplc="04090019" w:tentative="1">
+      <w:start w:val="1"/>
+      <w:numFmt w:val="lowerLetter"/>
+      <w:lvlText w:val="%2."/>
+      <w:lvlJc w:val="left"/>
+      <w:pPr>
+        <w:ind w:left="1440" w:hanging="360"/>
+      </w:pPr>
+    </w:lvl>
+    <w:lvl w:ilvl="2" w:tplc="0409001B" w:tentative="1">
+      <w:start w:val="1"/>
+      <w:numFmt w:val="lowerRoman"/>
+      <w:lvlText w:val="%3."/>
+      <w:lvlJc w:val="right"/>
+      <w:pPr>
+        <w:ind w:left="2160" w:hanging="180"/>
+      </w:pPr>
+    </w:lvl>
+    <w:lvl w:ilvl="3" w:tplc="0409000F" w:tentative="1">
+      <w:start w:val="1"/>
+      <w:numFmt w:val="decimal"/>
+      <w:lvlText w:val="%4."/>
+      <w:lvlJc w:val="left"/>
+      <w:pPr>
+        <w:ind w:left="2880" w:hanging="360"/>
+      </w:pPr>
+    </w:lvl>
+    <w:lvl w:ilvl="4" w:tplc="04090019" w:tentative="1">
+      <w:start w:val="1"/>
+      <w:numFmt w:val="lowerLetter"/>
+      <w:lvlText w:val="%5."/>
+      <w:lvlJc w:val="left"/>
+      <w:pPr>
+        <w:ind w:left="3600" w:hanging="360"/>
+      </w:pPr>
+    </w:lvl>
+    <w:lvl w:ilvl="5" w:tplc="0409001B" w:tentative="1">
+      <w:start w:val="1"/>
+      <w:numFmt w:val="lowerRoman"/>
+      <w:lvlText w:val="%6."/>
+      <w:lvlJc w:val="right"/>
+      <w:pPr>
+        <w:ind w:left="4320" w:hanging="180"/>
+      </w:pPr>
+    </w:lvl>
+    <w:lvl w:ilvl="6" w:tplc="0409000F" w:tentative="1">
+      <w:start w:val="1"/>
+      <w:numFmt w:val="decimal"/>
+      <w:lvlText w:val="%7."/>
+      <w:lvlJc w:val="left"/>
+      <w:pPr>
+        <w:ind w:left="5040" w:hanging="360"/>
+      </w:pPr>
+    </w:lvl>
+    <w:lvl w:ilvl="7" w:tplc="04090019" w:tentative="1">
+      <w:start w:val="1"/>
+      <w:numFmt w:val="lowerLetter"/>
+      <w:lvlText w:val="%8."/>
+      <w:lvlJc w:val="left"/>
+      <w:pPr>
+        <w:ind w:left="5760" w:hanging="360"/>
+      </w:pPr>
+    </w:lvl>
+    <w:lvl w:ilvl="8" w:tplc="0409001B" w:tentative="1">
+      <w:start w:val="1"/>
+      <w:numFmt w:val="lowerRoman"/>
+      <w:lvlText w:val="%9."/>
+      <w:lvlJc w:val="right"/>
+      <w:pPr>
+        <w:ind w:left="6480" w:hanging="180"/>
+      </w:pPr>
+    </w:lvl>
+  </w:abstractNum>
+  <w:abstractNum w:abstractNumId="6" w15:restartNumberingAfterBreak="0">
     <w:nsid w:val="30723E3B"/>
     <w:multiLevelType w:val="hybridMultilevel"/>
     <w:tmpl w:val="434ABF94"/>
@@ -3913,7 +5283,7 @@
       </w:pPr>
     </w:lvl>
   </w:abstractNum>
-  <w:abstractNum w:abstractNumId="6" w15:restartNumberingAfterBreak="0">
+  <w:abstractNum w:abstractNumId="7" w15:restartNumberingAfterBreak="0">
     <w:nsid w:val="38682FCC"/>
     <w:multiLevelType w:val="hybridMultilevel"/>
     <w:tmpl w:val="4BF43620"/>
@@ -4026,7 +5396,7 @@
       </w:rPr>
     </w:lvl>
   </w:abstractNum>
-  <w:abstractNum w:abstractNumId="7" w15:restartNumberingAfterBreak="0">
+  <w:abstractNum w:abstractNumId="8" w15:restartNumberingAfterBreak="0">
     <w:nsid w:val="3F055278"/>
     <w:multiLevelType w:val="hybridMultilevel"/>
     <w:tmpl w:val="1182E518"/>
@@ -4115,7 +5485,7 @@
       </w:pPr>
     </w:lvl>
   </w:abstractNum>
-  <w:abstractNum w:abstractNumId="8" w15:restartNumberingAfterBreak="0">
+  <w:abstractNum w:abstractNumId="9" w15:restartNumberingAfterBreak="0">
     <w:nsid w:val="4310021F"/>
     <w:multiLevelType w:val="hybridMultilevel"/>
     <w:tmpl w:val="27649340"/>
@@ -4204,7 +5574,7 @@
       </w:pPr>
     </w:lvl>
   </w:abstractNum>
-  <w:abstractNum w:abstractNumId="9" w15:restartNumberingAfterBreak="0">
+  <w:abstractNum w:abstractNumId="10" w15:restartNumberingAfterBreak="0">
     <w:nsid w:val="5AA4160E"/>
     <w:multiLevelType w:val="hybridMultilevel"/>
     <w:tmpl w:val="A23417D4"/>
@@ -4293,7 +5663,7 @@
       </w:pPr>
     </w:lvl>
   </w:abstractNum>
-  <w:abstractNum w:abstractNumId="10" w15:restartNumberingAfterBreak="0">
+  <w:abstractNum w:abstractNumId="11" w15:restartNumberingAfterBreak="0">
     <w:nsid w:val="69F521DC"/>
     <w:multiLevelType w:val="hybridMultilevel"/>
     <w:tmpl w:val="51D23AC8"/>
@@ -4406,7 +5776,7 @@
       </w:rPr>
     </w:lvl>
   </w:abstractNum>
-  <w:abstractNum w:abstractNumId="11" w15:restartNumberingAfterBreak="0">
+  <w:abstractNum w:abstractNumId="12" w15:restartNumberingAfterBreak="0">
     <w:nsid w:val="6C6818FF"/>
     <w:multiLevelType w:val="hybridMultilevel"/>
     <w:tmpl w:val="28AA56FE"/>
@@ -4523,19 +5893,19 @@
     <w:abstractNumId w:val="4"/>
   </w:num>
   <w:num w:numId="2" w16cid:durableId="1875776422">
-    <w:abstractNumId w:val="10"/>
+    <w:abstractNumId w:val="11"/>
   </w:num>
   <w:num w:numId="3" w16cid:durableId="497158195">
-    <w:abstractNumId w:val="6"/>
+    <w:abstractNumId w:val="7"/>
   </w:num>
   <w:num w:numId="4" w16cid:durableId="4720572">
     <w:abstractNumId w:val="3"/>
   </w:num>
   <w:num w:numId="5" w16cid:durableId="2044595052">
-    <w:abstractNumId w:val="9"/>
+    <w:abstractNumId w:val="10"/>
   </w:num>
   <w:num w:numId="6" w16cid:durableId="831674957">
-    <w:abstractNumId w:val="8"/>
+    <w:abstractNumId w:val="9"/>
   </w:num>
   <w:num w:numId="7" w16cid:durableId="915819194">
     <w:abstractNumId w:val="1"/>
@@ -4544,16 +5914,19 @@
     <w:abstractNumId w:val="0"/>
   </w:num>
   <w:num w:numId="9" w16cid:durableId="584538106">
-    <w:abstractNumId w:val="7"/>
+    <w:abstractNumId w:val="8"/>
   </w:num>
   <w:num w:numId="10" w16cid:durableId="794635937">
-    <w:abstractNumId w:val="5"/>
+    <w:abstractNumId w:val="6"/>
   </w:num>
   <w:num w:numId="11" w16cid:durableId="779105112">
-    <w:abstractNumId w:val="11"/>
+    <w:abstractNumId w:val="12"/>
   </w:num>
   <w:num w:numId="12" w16cid:durableId="1833449873">
     <w:abstractNumId w:val="2"/>
+  </w:num>
+  <w:num w:numId="13" w16cid:durableId="1213426241">
+    <w:abstractNumId w:val="5"/>
   </w:num>
 </w:numbering>
 </file>

</xml_diff>